<commit_message>
Enhance doc report and mobile app UI
</commit_message>
<xml_diff>
--- a/outputs/SupriyaSPoojary_Analysis_Report.docx
+++ b/outputs/SupriyaSPoojary_Analysis_Report.docx
@@ -4692,6 +4692,27 @@
           <w:i w:val="0"/>
           <w:sz w:val="24"/>
         </w:rPr>
+        <w:t>Models Trained and Evaluated</w:t>
+      </w:r>
+    </w:p>
+    <w:p>
+      <w:r>
+        <w:rPr>
+          <w:b w:val="0"/>
+          <w:i w:val="0"/>
+          <w:sz w:val="22"/>
+        </w:rPr>
+        <w:t>To determine the best approach, four different machine learning classification algorithms were trained and evaluated using 5-Fold Stratified Cross-Validation on the training data. These included Logistic Regression (a linear baseline), Random Forest (an ensemble bagging model), XGBoost (an advanced gradient boosting algorithm), and LightGBM (another gradient boosting framework).</w:t>
+      </w:r>
+    </w:p>
+    <w:p/>
+    <w:p>
+      <w:r>
+        <w:rPr>
+          <w:b/>
+          <w:i w:val="0"/>
+          <w:sz w:val="24"/>
+        </w:rPr>
         <w:t>Model Comparison — 5-Fold Cross-Validation Results</w:t>
       </w:r>
     </w:p>
@@ -5027,7 +5048,7 @@
                 <w:color w:val="1E1E1E"/>
                 <w:sz w:val="20"/>
               </w:rPr>
-              <w:t>Best balance of performance and interpretability</w:t>
+              <w:t>Best balance of performance, speed, and interpretability</w:t>
             </w:r>
           </w:p>
         </w:tc>
@@ -5105,12 +5126,84 @@
                 <w:color w:val="1E1E1E"/>
                 <w:sz w:val="20"/>
               </w:rPr>
-              <w:t>Marginally better AUC but less widely supported in production</w:t>
+              <w:t>Marginally better AUC but less widely supported in production workflows</w:t>
             </w:r>
           </w:p>
         </w:tc>
       </w:tr>
     </w:tbl>
+    <w:p/>
+    <w:p>
+      <w:r>
+        <w:rPr>
+          <w:b/>
+          <w:i w:val="0"/>
+          <w:color w:val="1F3864"/>
+          <w:sz w:val="24"/>
+        </w:rPr>
+        <w:t>Why XGBoost Was Selected</w:t>
+      </w:r>
+    </w:p>
+    <w:p>
+      <w:pPr>
+        <w:pStyle w:val="ListBullet"/>
+        <w:ind w:left="432"/>
+      </w:pPr>
+      <w:r>
+        <w:rPr>
+          <w:sz w:val="22"/>
+        </w:rPr>
+        <w:t>Performance: It achieved near-top cross-validation ROC-AUC (0.9492), proving its high accuracy.</w:t>
+      </w:r>
+    </w:p>
+    <w:p>
+      <w:pPr>
+        <w:pStyle w:val="ListBullet"/>
+        <w:ind w:left="432"/>
+      </w:pPr>
+      <w:r>
+        <w:rPr>
+          <w:sz w:val="22"/>
+        </w:rPr>
+        <w:t>Imbalance Handling: Built-in parameters like 'scale_pos_weight' effectively handle the 9% fraud class imbalance without heavily relying only on SMOTE.</w:t>
+      </w:r>
+    </w:p>
+    <w:p>
+      <w:pPr>
+        <w:pStyle w:val="ListBullet"/>
+        <w:ind w:left="432"/>
+      </w:pPr>
+      <w:r>
+        <w:rPr>
+          <w:sz w:val="22"/>
+        </w:rPr>
+        <w:t>Non-Linear Patterns: Fraud patterns are highly non-linear and complex, which XGBoost models natively capture better than linear models.</w:t>
+      </w:r>
+    </w:p>
+    <w:p>
+      <w:pPr>
+        <w:pStyle w:val="ListBullet"/>
+        <w:ind w:left="432"/>
+      </w:pPr>
+      <w:r>
+        <w:rPr>
+          <w:sz w:val="22"/>
+        </w:rPr>
+        <w:t>Feature Importance: It provides clear internal feature importance metrics, which is crucial for explaining fraud alerts to insurance investigators.</w:t>
+      </w:r>
+    </w:p>
+    <w:p>
+      <w:pPr>
+        <w:pStyle w:val="ListBullet"/>
+        <w:ind w:left="432"/>
+      </w:pPr>
+      <w:r>
+        <w:rPr>
+          <w:sz w:val="22"/>
+        </w:rPr>
+        <w:t>Industry Standard: XGBoost is a proven, production-ready algorithm widely adopted by banks and insurance companies for fraud detection.</w:t>
+      </w:r>
+    </w:p>
     <w:p/>
     <w:p>
       <w:r>

</xml_diff>